<commit_message>
Deploy a produccion, actualizacion de base de datos y fix de SeedData
</commit_message>
<xml_diff>
--- a/docs/Manuales/Manual_Administrador.docx
+++ b/docs/Manuales/Manual_Administrador.docx
@@ -676,6 +676,83 @@
         <w:t>Ilustración: Administración de Usuarios y Roles</w:t>
       </w:r>
     </w:p>
+    <w:p>
+      <w:r>
+        <w:br w:type="page"/>
+      </w:r>
+    </w:p>
+    <w:p>
+      <w:pPr>
+        <w:pStyle w:val="Heading1"/>
+      </w:pPr>
+      <w:r>
+        <w:t>Anexo: Nuevas Funcionalidades</w:t>
+      </w:r>
+    </w:p>
+    <w:p>
+      <w:pPr>
+        <w:pStyle w:val="Heading2"/>
+      </w:pPr>
+      <w:r>
+        <w:t>Objetivos y Seguimiento</w:t>
+      </w:r>
+    </w:p>
+    <w:p>
+      <w:r>
+        <w:t>Como Administrador, notarás que la vista de Objetivos se divide en solapas específicas para facilitar la gestión:</w:t>
+        <w:br/>
+        <w:t>- Objetivos de mi Equipo: Aquí verás únicamente a los colaboradores que te reportan de forma directa, permitiéndote un seguimiento enfocado como líder.</w:t>
+        <w:br/>
+        <w:t>- Toda la Organización: Esta solapa es exclusiva de tu perfil administrador y te permite tener una visión global y auditar el progreso de cualquier colaborador de la empresa.</w:t>
+      </w:r>
+    </w:p>
+    <w:p>
+      <w:pPr>
+        <w:pStyle w:val="Heading2"/>
+      </w:pPr>
+      <w:r>
+        <w:t>Autoevaluación</w:t>
+      </w:r>
+    </w:p>
+    <w:p>
+      <w:r>
+        <w:t>Además de poder visualizar las autoevaluaciones de tu equipo, como líder también tienes el deber de completar tus propias autoevaluaciones. Para ello, dirígete a la solapa 'Pendientes de Autoevaluar', donde encontrarás tus propios objetivos listos para que ingreses tus comentarios y evidencias.</w:t>
+      </w:r>
+    </w:p>
+    <w:p>
+      <w:pPr>
+        <w:pStyle w:val="Heading2"/>
+      </w:pPr>
+      <w:r>
+        <w:t>Calendario</w:t>
+      </w:r>
+    </w:p>
+    <w:p>
+      <w:r>
+        <w:t>El Calendario está diseñado para darte visibilidad sobre los Hitos del Proceso (ej. Fechas de corte para evaluaciones de mitad de año y cierre final) a nivel compañía, sin sobrecargarse visualmente con las tareas operativas pendientes de cada empleado individual.</w:t>
+      </w:r>
+    </w:p>
+    <w:p>
+      <w:pPr>
+        <w:pStyle w:val="Heading2"/>
+      </w:pPr>
+      <w:r>
+        <w:t>Progreso del Objetivo</w:t>
+      </w:r>
+    </w:p>
+    <w:p>
+      <w:r>
+        <w:t>La columna Progreso te permite saber en qué etapa del proceso de evaluación se encuentra cada objetivo. A medida que completes las distintas fases, la barra avanzará automáticamente:</w:t>
+        <w:br/>
+        <w:t>- 0%: El objetivo está activo.</w:t>
+        <w:br/>
+        <w:t>- 33%: Has completado y enviado tu Autoevaluación exitosamente.</w:t>
+        <w:br/>
+        <w:t>- 66%: Tu líder ha completado la instancia de Feedback de Mitad de Año.</w:t>
+        <w:br/>
+        <w:t>- 100%: El ciclo ha cerrado con la Evaluación Final.</w:t>
+      </w:r>
+    </w:p>
     <w:sectPr>
       <w:pgSz w:w="12240" w:h="15840"/>
       <w:pgMar w:top="1440" w:right="1800" w:bottom="1440" w:left="1800" w:header="720" w:footer="720" w:gutter="0"/>

</xml_diff>